<commit_message>
Artigo atualizado (faltam imagens da plataforma)
</commit_message>
<xml_diff>
--- a/docs/Artigo/DRAFT - Artigo por-en PI 2.docx
+++ b/docs/Artigo/DRAFT - Artigo por-en PI 2.docx
@@ -1182,17 +1182,17 @@
         </w:rPr>
         <w:t xml:space="preserve">, </w:t>
       </w:r>
-      <w:proofErr w:type="spellStart"/>
-      <w:r>
-        <w:rPr>
-          <w:rFonts w:ascii="Times New Roman" w:hAnsi="Times New Roman" w:cs="Times New Roman"/>
-          <w:i/>
-          <w:sz w:val="24"/>
-          <w:szCs w:val="24"/>
-        </w:rPr>
-        <w:t>including</w:t>
-      </w:r>
-      <w:proofErr w:type="spellEnd"/>
+      <w:r>
+        <w:rPr>
+          <w:rFonts w:ascii="Times New Roman" w:hAnsi="Times New Roman" w:cs="Times New Roman"/>
+          <w:i/>
+          <w:sz w:val="24"/>
+          <w:szCs w:val="24"/>
+        </w:rPr>
+        <w:t>like</w:t>
+      </w:r>
+      <w:bookmarkStart w:id="0" w:name="_GoBack"/>
+      <w:bookmarkEnd w:id="0"/>
       <w:r>
         <w:rPr>
           <w:rFonts w:ascii="Times New Roman" w:hAnsi="Times New Roman" w:cs="Times New Roman"/>
@@ -1201,106 +1201,6 @@
           <w:szCs w:val="24"/>
         </w:rPr>
         <w:t xml:space="preserve"> Next.js, </w:t>
-      </w:r>
-      <w:proofErr w:type="spellStart"/>
-      <w:r>
-        <w:rPr>
-          <w:rFonts w:ascii="Times New Roman" w:hAnsi="Times New Roman" w:cs="Times New Roman"/>
-          <w:i/>
-          <w:sz w:val="24"/>
-          <w:szCs w:val="24"/>
-        </w:rPr>
-        <w:t>React</w:t>
-      </w:r>
-      <w:proofErr w:type="spellEnd"/>
-      <w:r>
-        <w:rPr>
-          <w:rFonts w:ascii="Times New Roman" w:hAnsi="Times New Roman" w:cs="Times New Roman"/>
-          <w:i/>
-          <w:sz w:val="24"/>
-          <w:szCs w:val="24"/>
-        </w:rPr>
-        <w:t xml:space="preserve">, </w:t>
-      </w:r>
-      <w:proofErr w:type="spellStart"/>
-      <w:r>
-        <w:rPr>
-          <w:rFonts w:ascii="Times New Roman" w:hAnsi="Times New Roman" w:cs="Times New Roman"/>
-          <w:i/>
-          <w:sz w:val="24"/>
-          <w:szCs w:val="24"/>
-        </w:rPr>
-        <w:t>TypeScript</w:t>
-      </w:r>
-      <w:proofErr w:type="spellEnd"/>
-      <w:r>
-        <w:rPr>
-          <w:rFonts w:ascii="Times New Roman" w:hAnsi="Times New Roman" w:cs="Times New Roman"/>
-          <w:i/>
-          <w:sz w:val="24"/>
-          <w:szCs w:val="24"/>
-        </w:rPr>
-        <w:t xml:space="preserve">, Node.js, MySQL, Prisma ORM, NextAuth.js, </w:t>
-      </w:r>
-      <w:proofErr w:type="spellStart"/>
-      <w:r>
-        <w:rPr>
-          <w:rFonts w:ascii="Times New Roman" w:hAnsi="Times New Roman" w:cs="Times New Roman"/>
-          <w:i/>
-          <w:sz w:val="24"/>
-          <w:szCs w:val="24"/>
-        </w:rPr>
-        <w:t>Tailwind</w:t>
-      </w:r>
-      <w:proofErr w:type="spellEnd"/>
-      <w:r>
-        <w:rPr>
-          <w:rFonts w:ascii="Times New Roman" w:hAnsi="Times New Roman" w:cs="Times New Roman"/>
-          <w:i/>
-          <w:sz w:val="24"/>
-          <w:szCs w:val="24"/>
-        </w:rPr>
-        <w:t xml:space="preserve"> CSS, GSAP, </w:t>
-      </w:r>
-      <w:proofErr w:type="spellStart"/>
-      <w:r>
-        <w:rPr>
-          <w:rFonts w:ascii="Times New Roman" w:hAnsi="Times New Roman" w:cs="Times New Roman"/>
-          <w:i/>
-          <w:sz w:val="24"/>
-          <w:szCs w:val="24"/>
-        </w:rPr>
-        <w:t>and</w:t>
-      </w:r>
-      <w:proofErr w:type="spellEnd"/>
-      <w:r>
-        <w:rPr>
-          <w:rFonts w:ascii="Times New Roman" w:hAnsi="Times New Roman" w:cs="Times New Roman"/>
-          <w:i/>
-          <w:sz w:val="24"/>
-          <w:szCs w:val="24"/>
-        </w:rPr>
-        <w:t xml:space="preserve"> </w:t>
-      </w:r>
-      <w:proofErr w:type="spellStart"/>
-      <w:r>
-        <w:rPr>
-          <w:rFonts w:ascii="Times New Roman" w:hAnsi="Times New Roman" w:cs="Times New Roman"/>
-          <w:i/>
-          <w:sz w:val="24"/>
-          <w:szCs w:val="24"/>
-        </w:rPr>
-        <w:t>Recharts</w:t>
-      </w:r>
-      <w:proofErr w:type="spellEnd"/>
-      <w:r>
-        <w:rPr>
-          <w:rFonts w:ascii="Times New Roman" w:hAnsi="Times New Roman" w:cs="Times New Roman"/>
-          <w:i/>
-          <w:sz w:val="24"/>
-          <w:szCs w:val="24"/>
-        </w:rPr>
-        <w:t xml:space="preserve">, </w:t>
       </w:r>
       <w:proofErr w:type="spellStart"/>
       <w:r>
@@ -2604,39 +2504,13 @@
       </w:r>
       <w:proofErr w:type="spellEnd"/>
       <w:r>
-        <w:t xml:space="preserve">, uma plataforma web destinada à preparação de estudantes da área de Tecnologia da Informação para entrevistas técnicas de emprego por meio de simulações realizadas em tempo real com profissionais experientes. O sistema foi desenvolvido com o objetivo de reduzir a distância entre a formação acadêmica e as exigências do mercado de tecnologia, proporcionando experiências práticas de entrevistas, feedbacks personalizados e contato direto com profissionais atuantes no setor. A plataforma foi implementada utilizando tecnologias modernas de desenvolvimento web, incluindo Next.js, </w:t>
-      </w:r>
-      <w:proofErr w:type="spellStart"/>
-      <w:r>
-        <w:t>React</w:t>
-      </w:r>
-      <w:proofErr w:type="spellEnd"/>
-      <w:r>
-        <w:t xml:space="preserve">, </w:t>
-      </w:r>
-      <w:proofErr w:type="spellStart"/>
-      <w:r>
-        <w:t>TypeScript</w:t>
-      </w:r>
-      <w:proofErr w:type="spellEnd"/>
-      <w:r>
-        <w:t xml:space="preserve">, Node.js, MySQL, Prisma ORM, NextAuth.js, </w:t>
-      </w:r>
-      <w:proofErr w:type="spellStart"/>
-      <w:r>
-        <w:t>Tailwind</w:t>
-      </w:r>
-      <w:proofErr w:type="spellEnd"/>
-      <w:r>
-        <w:t xml:space="preserve"> CSS, GSAP e </w:t>
-      </w:r>
-      <w:proofErr w:type="spellStart"/>
-      <w:r>
-        <w:t>Recharts</w:t>
-      </w:r>
-      <w:proofErr w:type="spellEnd"/>
-      <w:r>
-        <w:t xml:space="preserve">, garantindo escalabilidade, segurança, responsividade e uma experiência intuitiva ao usuário. Entre suas principais funcionalidades destacam-se a autenticação de usuários, cadastro de mentores, agendamento de entrevistas, </w:t>
+        <w:t xml:space="preserve">, uma plataforma web destinada à preparação de estudantes da área de Tecnologia da Informação para entrevistas técnicas de emprego por meio de simulações realizadas em tempo real com profissionais experientes. O sistema foi desenvolvido com o objetivo de reduzir a distância entre a formação acadêmica e as exigências do mercado de tecnologia, proporcionando experiências práticas de entrevistas, feedbacks personalizados e contato direto com profissionais atuantes no setor. A plataforma foi implementada utilizando tecnologias modernas de desenvolvimento web, </w:t>
+      </w:r>
+      <w:r>
+        <w:t>como</w:t>
+      </w:r>
+      <w:r>
+        <w:t xml:space="preserve"> Next.js, garantindo escalabilidade, segurança, responsividade e uma experiência intuitiva ao usuário. Entre suas principais funcionalidades destacam-se a autenticação de usuários, cadastro de mentores, agendamento de entrevistas, </w:t>
       </w:r>
       <w:r>
         <w:t>gerenciamento das entrevistas simuladas</w:t>
@@ -2645,14 +2519,14 @@
         <w:t xml:space="preserve">, avaliação de desempenho e emissão de feedbacks personalizados. Os resultados obtidos demonstram que a plataforma oferece um ambiente realista e estruturado capaz de contribuir para o desenvolvimento de competências técnicas, comportamentais e comunicacionais, </w:t>
       </w:r>
       <w:r>
-        <w:t xml:space="preserve">especialmente em entrevistas realizadas em língua inglesa, cuja proficiência é frequentemente apontada como um diferencial </w:t>
+        <w:t>especialmente em entrevistas realizadas em língua inglesa, cuja proficiência é frequentemente apontada como um diferencial competitivo para profissionais que atuam em empresas multinacionais e no mercado global de tecnologia</w:t>
+      </w:r>
+      <w:r>
+        <w:t xml:space="preserve">. A solução </w:t>
       </w:r>
       <w:r>
         <w:lastRenderedPageBreak/>
-        <w:t>competitivo para profissionais que atuam em empresas multinacionais e no mercado global de tecnologia</w:t>
-      </w:r>
-      <w:r>
-        <w:t>. A solução proposta fortalece a empregabilidade dos estudantes e aproxima instituições de ensino das demandas atuais do mercado de tecnologia.</w:t>
+        <w:t>proposta fortalece a empregabilidade dos estudantes e aproxima instituições de ensino das demandas atuais do mercado de tecnologia.</w:t>
       </w:r>
     </w:p>
     <w:p>
@@ -2768,21 +2642,18 @@
         <w:t xml:space="preserve"> 2025</w:t>
       </w:r>
       <w:r>
-        <w:t xml:space="preserve">, competências como pensamento analítico, resolução de problemas, comunicação, adaptabilidade e domínio de novas tecnologias figuram entre as habilidades mais valorizadas pelos empregadores para os próximos anos. </w:t>
-      </w:r>
-      <w:r>
-        <w:t xml:space="preserve">No Brasil, estudos da </w:t>
-      </w:r>
-      <w:proofErr w:type="spellStart"/>
-      <w:r>
-        <w:t>Brasscom</w:t>
-      </w:r>
-      <w:proofErr w:type="spellEnd"/>
-      <w:r>
-        <w:t xml:space="preserve"> indicam que o mercado de Tecnologia da Informação continua apresentando crescimento na demanda por profissionais qualificados, enquanto a formação de novos talentos ainda permanece inferior às necessidades do setor, evidenciando um descompasso entre oferta e demanda de mão de obra especializada</w:t>
-      </w:r>
-      <w:r>
-        <w:t>.</w:t>
+        <w:t xml:space="preserve">, competências como pensamento analítico, resolução de problemas, comunicação, adaptabilidade e domínio de novas tecnologias figuram entre as habilidades mais valorizadas pelos empregadores para os próximos </w:t>
+      </w:r>
+      <w:proofErr w:type="gramStart"/>
+      <w:r>
+        <w:t>anos.</w:t>
+      </w:r>
+      <w:r>
+        <w:t>[</w:t>
+      </w:r>
+      <w:proofErr w:type="gramEnd"/>
+      <w:r>
+        <w:t xml:space="preserve">1] </w:t>
       </w:r>
     </w:p>
     <w:p>
@@ -2793,7 +2664,29 @@
         <w:jc w:val="both"/>
       </w:pPr>
       <w:r>
-        <w:t>Embora os cursos de graduação e educação profissional proporcionem sólida formação técnica, muitos estudantes concluem sua formação sem vivenciar situações semelhantes às encontradas em processos seletivos reais. Além do conhecimento técnico, entrevistas de emprego frequentemente avaliam competências comportamentais, capacidade de comunicação, raciocínio lógico e, em muitas empresas de tecnologia, proficiência na língua inglesa, aspectos que nem sempre são explorados durante a formação acadêmica.</w:t>
+        <w:t xml:space="preserve">No Brasil, estudos da </w:t>
+      </w:r>
+      <w:proofErr w:type="spellStart"/>
+      <w:r>
+        <w:t>Brasscom</w:t>
+      </w:r>
+      <w:proofErr w:type="spellEnd"/>
+      <w:r>
+        <w:t xml:space="preserve"> indicam que o mercado de Tecnologia da Informação continua apresentando crescimento na demanda por profissionais qualificados, enquanto a formação de novos talentos ainda permanece inferior às necessidades do setor, evidenciando um descompasso entre oferta e demanda de mão de obra </w:t>
+      </w:r>
+      <w:proofErr w:type="gramStart"/>
+      <w:r>
+        <w:t>especializada</w:t>
+      </w:r>
+      <w:r>
+        <w:t>.</w:t>
+      </w:r>
+      <w:r>
+        <w:t>[</w:t>
+      </w:r>
+      <w:proofErr w:type="gramEnd"/>
+      <w:r>
+        <w:t>2]</w:t>
       </w:r>
     </w:p>
     <w:p>
@@ -2804,7 +2697,18 @@
         <w:jc w:val="both"/>
       </w:pPr>
       <w:r>
-        <w:t>Diversas plataformas disponíveis atualmente oferecem recursos voltados ao ensino de idiomas, preparação para entrevistas ou desenvolvimento profissional. Entretanto, observa-se que poucas soluções integram esses elementos em um único ambiente direcionado especificamente aos estudantes da área de Tecnologia da Informação. Em muitos casos, as plataformas concentram-se exclusivamente no aprendizado de idiomas, em entrevistas automatizadas baseadas em inteligência artificial ou em sessões genéricas de conversação, sem proporcionar entrevistas técnicas conduzidas por profissionais com experiência prática no mercado. Como consequência, estudantes ingressam em processos seletivos sem a oportunidade de desenvolver habilidades em um ambiente seguro, colaborativo e semelhante ao contexto profissional.</w:t>
+        <w:t xml:space="preserve">Embora os cursos de graduação e educação profissional proporcionem sólida formação técnica, muitos estudantes concluem sua formação sem vivenciar situações semelhantes às encontradas em processos seletivos reais. Além do conhecimento técnico, entrevistas de emprego frequentemente avaliam competências comportamentais, capacidade de comunicação, raciocínio lógico e, em muitas empresas de tecnologia, proficiência na língua inglesa, aspectos que nem sempre são explorados durante a formação </w:t>
+      </w:r>
+      <w:proofErr w:type="gramStart"/>
+      <w:r>
+        <w:t>acadêmica.</w:t>
+      </w:r>
+      <w:r>
+        <w:t>[</w:t>
+      </w:r>
+      <w:proofErr w:type="gramEnd"/>
+      <w:r>
+        <w:t>3]</w:t>
       </w:r>
     </w:p>
     <w:p>
@@ -2815,25 +2719,7 @@
         <w:jc w:val="both"/>
       </w:pPr>
       <w:r>
-        <w:t xml:space="preserve">Diante desse cenário, foi desenvolvido o </w:t>
-      </w:r>
-      <w:proofErr w:type="spellStart"/>
-      <w:r>
-        <w:rPr>
-          <w:rStyle w:val="Forte"/>
-          <w:b w:val="0"/>
-        </w:rPr>
-        <w:t>MockMentor</w:t>
-      </w:r>
-      <w:proofErr w:type="spellEnd"/>
-      <w:r>
-        <w:t>, uma plataforma web destinada ao gerenciamento de entrevistas simuladas conduzidas por profissionais experientes da área de tecnologia. O sistema foi concebido para oferecer um ambiente colaborativo que permita aos estudantes praticar entrevistas técnicas, desenvolver competências comportamentais e comunicacionais e receber feedbacks personalizados capazes de orientar sua evolução profissional</w:t>
-      </w:r>
-      <w:r>
-        <w:t xml:space="preserve">. </w:t>
-      </w:r>
-      <w:r>
-        <w:t>Além de preparar os participantes para processos seletivos conduzidos em português, a plataforma contempla entrevistas realizadas em língua inglesa, refletindo uma das principais demandas do mercado internacional de tecnologia.</w:t>
+        <w:t>Diversas plataformas disponíveis atualmente oferecem recursos voltados ao ensino de idiomas, preparação para entrevistas ou desenvolvimento profissional. Entretanto, observa-se que poucas soluções integram esses elementos em um único ambiente direcionado especificamente aos estudantes da área de Tecnologia da Informação. Em muitos casos, as plataformas concentram-se exclusivamente no aprendizado de idiomas, em entrevistas automatizadas baseadas em inteligência artificial ou em sessões genéricas de conversação, sem proporcionar entrevistas técnicas conduzidas por profissionais com experiência prática no mercado. Como consequência, estudantes ingressam em processos seletivos sem a oportunidade de desenvolver habilidades em um ambiente seguro, colaborativo e semelhante ao contexto profissional.</w:t>
       </w:r>
     </w:p>
     <w:p>
@@ -2844,148 +2730,25 @@
         <w:jc w:val="both"/>
       </w:pPr>
       <w:r>
-        <w:t xml:space="preserve">A arquitetura da plataforma foi desenvolvida utilizando tecnologias modernas amplamente empregadas na construção de aplicações web, como </w:t>
-      </w:r>
+        <w:t xml:space="preserve">Diante desse cenário, foi desenvolvido o </w:t>
+      </w:r>
+      <w:proofErr w:type="spellStart"/>
       <w:r>
         <w:rPr>
           <w:rStyle w:val="Forte"/>
           <w:b w:val="0"/>
         </w:rPr>
-        <w:t>Next.js</w:t>
-      </w:r>
-      <w:r>
-        <w:t xml:space="preserve">, </w:t>
-      </w:r>
-      <w:proofErr w:type="spellStart"/>
-      <w:r>
-        <w:rPr>
-          <w:rStyle w:val="Forte"/>
-          <w:b w:val="0"/>
-        </w:rPr>
-        <w:t>React</w:t>
-      </w:r>
-      <w:proofErr w:type="spellEnd"/>
-      <w:r>
-        <w:t xml:space="preserve">, </w:t>
-      </w:r>
-      <w:proofErr w:type="spellStart"/>
-      <w:r>
-        <w:rPr>
-          <w:rStyle w:val="Forte"/>
-          <w:b w:val="0"/>
-        </w:rPr>
-        <w:t>TypeScript</w:t>
-      </w:r>
-      <w:proofErr w:type="spellEnd"/>
-      <w:r>
-        <w:t xml:space="preserve">, </w:t>
-      </w:r>
-      <w:r>
-        <w:rPr>
-          <w:rStyle w:val="Forte"/>
-          <w:b w:val="0"/>
-        </w:rPr>
-        <w:t>Node.js</w:t>
-      </w:r>
-      <w:r>
-        <w:t xml:space="preserve">, </w:t>
-      </w:r>
-      <w:r>
-        <w:rPr>
-          <w:rStyle w:val="Forte"/>
-          <w:b w:val="0"/>
-        </w:rPr>
-        <w:t>Prisma</w:t>
-      </w:r>
-      <w:r>
-        <w:rPr>
-          <w:rStyle w:val="Forte"/>
-        </w:rPr>
-        <w:t xml:space="preserve"> </w:t>
-      </w:r>
-      <w:r>
-        <w:rPr>
-          <w:rStyle w:val="Forte"/>
-          <w:b w:val="0"/>
-        </w:rPr>
-        <w:t>ORM</w:t>
-      </w:r>
-      <w:r>
-        <w:t xml:space="preserve">, </w:t>
-      </w:r>
-      <w:r>
-        <w:rPr>
-          <w:rStyle w:val="Forte"/>
-          <w:b w:val="0"/>
-        </w:rPr>
-        <w:t>MySQL</w:t>
-      </w:r>
-      <w:r>
-        <w:t xml:space="preserve">, </w:t>
-      </w:r>
-      <w:r>
-        <w:rPr>
-          <w:rStyle w:val="Forte"/>
-          <w:b w:val="0"/>
-        </w:rPr>
-        <w:t>NextAuth.js</w:t>
-      </w:r>
-      <w:r>
-        <w:t xml:space="preserve">, </w:t>
-      </w:r>
-      <w:proofErr w:type="spellStart"/>
-      <w:r>
-        <w:rPr>
-          <w:rStyle w:val="Forte"/>
-          <w:b w:val="0"/>
-        </w:rPr>
-        <w:t>Tailwind</w:t>
-      </w:r>
-      <w:proofErr w:type="spellEnd"/>
-      <w:r>
-        <w:rPr>
-          <w:rStyle w:val="Forte"/>
-        </w:rPr>
-        <w:t xml:space="preserve"> </w:t>
-      </w:r>
-      <w:r>
-        <w:rPr>
-          <w:rStyle w:val="Forte"/>
-          <w:b w:val="0"/>
-        </w:rPr>
-        <w:t>CSS</w:t>
-      </w:r>
-      <w:r>
-        <w:t xml:space="preserve">, </w:t>
-      </w:r>
-      <w:r>
-        <w:rPr>
-          <w:rStyle w:val="Forte"/>
-          <w:b w:val="0"/>
-        </w:rPr>
-        <w:t>GSAP</w:t>
-      </w:r>
-      <w:r>
-        <w:t xml:space="preserve"> e </w:t>
-      </w:r>
-      <w:proofErr w:type="spellStart"/>
-      <w:r>
-        <w:rPr>
-          <w:rStyle w:val="Forte"/>
-          <w:b w:val="0"/>
-        </w:rPr>
-        <w:lastRenderedPageBreak/>
-        <w:t>Recharts</w:t>
-      </w:r>
-      <w:proofErr w:type="spellEnd"/>
-      <w:r>
-        <w:t>, possibilitando uma aplicação responsiva, segura e escalável. A adoção de uma arquitetura cliente-servidor, aliada às boas práticas de engenharia de software, favorece a manutenção da aplicação, a reutilização de componentes e a evolução contínua das funcionalidade</w:t>
-      </w:r>
-      <w:r>
-        <w:t>s</w:t>
-      </w:r>
-      <w:r>
-        <w:t>.</w:t>
+        <w:t>MockMentor</w:t>
+      </w:r>
+      <w:proofErr w:type="spellEnd"/>
+      <w:r>
+        <w:t>, uma plataforma web destinada ao gerenciamento de entrevistas simuladas conduzidas por profissionais experientes da área de tecnologia. O sistema foi concebido para oferecer um ambiente colaborativo que permita aos estudantes praticar entrevistas técnicas, desenvolver competências comportamentais e comunicacionais e receber feedbacks personalizados capazes de orientar sua evolução profissional</w:t>
+      </w:r>
+      <w:r>
+        <w:t xml:space="preserve">. </w:t>
+      </w:r>
+      <w:r>
+        <w:t>Além de preparar os participantes para processos seletivos conduzidos em português, a plataforma contempla entrevistas realizadas em língua inglesa, refletindo uma das principais demandas do mercado internacional de tecnologia.</w:t>
       </w:r>
     </w:p>
     <w:p>
@@ -2996,6 +2759,161 @@
         <w:jc w:val="both"/>
       </w:pPr>
       <w:r>
+        <w:t xml:space="preserve">A arquitetura da plataforma foi desenvolvida utilizando tecnologias modernas amplamente empregadas na construção de aplicações web, como </w:t>
+      </w:r>
+      <w:r>
+        <w:rPr>
+          <w:rStyle w:val="Forte"/>
+          <w:b w:val="0"/>
+        </w:rPr>
+        <w:t>Next.js</w:t>
+      </w:r>
+      <w:r>
+        <w:t xml:space="preserve">, </w:t>
+      </w:r>
+      <w:proofErr w:type="spellStart"/>
+      <w:r>
+        <w:rPr>
+          <w:rStyle w:val="Forte"/>
+          <w:b w:val="0"/>
+        </w:rPr>
+        <w:t>React</w:t>
+      </w:r>
+      <w:proofErr w:type="spellEnd"/>
+      <w:r>
+        <w:t xml:space="preserve">, </w:t>
+      </w:r>
+      <w:proofErr w:type="spellStart"/>
+      <w:r>
+        <w:rPr>
+          <w:rStyle w:val="Forte"/>
+          <w:b w:val="0"/>
+        </w:rPr>
+        <w:t>TypeScript</w:t>
+      </w:r>
+      <w:proofErr w:type="spellEnd"/>
+      <w:r>
+        <w:t xml:space="preserve">, </w:t>
+      </w:r>
+      <w:r>
+        <w:rPr>
+          <w:rStyle w:val="Forte"/>
+          <w:b w:val="0"/>
+        </w:rPr>
+        <w:t>Node.js</w:t>
+      </w:r>
+      <w:r>
+        <w:t xml:space="preserve">, </w:t>
+      </w:r>
+      <w:r>
+        <w:rPr>
+          <w:rStyle w:val="Forte"/>
+          <w:b w:val="0"/>
+        </w:rPr>
+        <w:t>Prisma</w:t>
+      </w:r>
+      <w:r>
+        <w:rPr>
+          <w:rStyle w:val="Forte"/>
+        </w:rPr>
+        <w:t xml:space="preserve"> </w:t>
+      </w:r>
+      <w:r>
+        <w:rPr>
+          <w:rStyle w:val="Forte"/>
+          <w:b w:val="0"/>
+        </w:rPr>
+        <w:t>ORM</w:t>
+      </w:r>
+      <w:r>
+        <w:t xml:space="preserve">, </w:t>
+      </w:r>
+      <w:r>
+        <w:rPr>
+          <w:rStyle w:val="Forte"/>
+          <w:b w:val="0"/>
+        </w:rPr>
+        <w:t>MySQL</w:t>
+      </w:r>
+      <w:r>
+        <w:t xml:space="preserve">, </w:t>
+      </w:r>
+      <w:r>
+        <w:rPr>
+          <w:rStyle w:val="Forte"/>
+          <w:b w:val="0"/>
+        </w:rPr>
+        <w:t>NextAuth.js</w:t>
+      </w:r>
+      <w:r>
+        <w:t xml:space="preserve">, </w:t>
+      </w:r>
+      <w:proofErr w:type="spellStart"/>
+      <w:r>
+        <w:rPr>
+          <w:rStyle w:val="Forte"/>
+          <w:b w:val="0"/>
+        </w:rPr>
+        <w:t>Tailwind</w:t>
+      </w:r>
+      <w:proofErr w:type="spellEnd"/>
+      <w:r>
+        <w:rPr>
+          <w:rStyle w:val="Forte"/>
+        </w:rPr>
+        <w:t xml:space="preserve"> </w:t>
+      </w:r>
+      <w:r>
+        <w:rPr>
+          <w:rStyle w:val="Forte"/>
+          <w:b w:val="0"/>
+        </w:rPr>
+        <w:t>CSS</w:t>
+      </w:r>
+      <w:r>
+        <w:t xml:space="preserve">, </w:t>
+      </w:r>
+      <w:r>
+        <w:rPr>
+          <w:rStyle w:val="Forte"/>
+          <w:b w:val="0"/>
+        </w:rPr>
+        <w:t>GSAP</w:t>
+      </w:r>
+      <w:r>
+        <w:t xml:space="preserve"> e </w:t>
+      </w:r>
+      <w:proofErr w:type="spellStart"/>
+      <w:r>
+        <w:rPr>
+          <w:rStyle w:val="Forte"/>
+          <w:b w:val="0"/>
+        </w:rPr>
+        <w:t>Recharts</w:t>
+      </w:r>
+      <w:proofErr w:type="spellEnd"/>
+      <w:r>
+        <w:t xml:space="preserve">, possibilitando uma aplicação responsiva, segura e escalável. A adoção de uma </w:t>
+      </w:r>
+      <w:r>
+        <w:lastRenderedPageBreak/>
+        <w:t>arquitetura cliente-servidor, aliada às boas práticas de engenharia de software, favorece a manutenção da aplicação, a reutilização de componentes e a evolução contínua das funcionalidade</w:t>
+      </w:r>
+      <w:r>
+        <w:t>s</w:t>
+      </w:r>
+      <w:r>
+        <w:t>.</w:t>
+      </w:r>
+    </w:p>
+    <w:p>
+      <w:pPr>
+        <w:pStyle w:val="NormalWeb"/>
+        <w:spacing w:before="0" w:beforeAutospacing="0" w:after="0" w:afterAutospacing="0"/>
+        <w:ind w:firstLine="284"/>
+        <w:jc w:val="both"/>
+      </w:pPr>
+      <w:r>
         <w:t xml:space="preserve">O </w:t>
       </w:r>
       <w:proofErr w:type="spellStart"/>
@@ -3004,7 +2922,13 @@
       </w:r>
       <w:proofErr w:type="spellEnd"/>
       <w:r>
-        <w:t xml:space="preserve"> foi desenvolvido considerando dois perfis principais de usuários: estudantes e mentores. Os estudantes podem criar seus perfis, selecionar áreas de interesse, agendar entrevistas simuladas, acompanhar sua evolução por meio dos feedbacks recebidos e acessar as gravações das entrevistas para fins exclusivamente educacionais. Os mentores, por sua vez, são responsáveis pela condução das entrevistas, avaliação do desempenho dos participantes, emissão de recomendações individualizadas e definição das plataformas de videoconferência utilizadas em cada sessão, aproximando o ambiente acadêmico da realidade vivenciada pelas empresas de tecnologia.</w:t>
+        <w:t xml:space="preserve"> foi desenvolvido considerando dois perfis principais de usuários: estudantes e mentores. Os estudantes podem criar seus perfis, selecionar áreas de interesse, agendar entrevistas simuladas, acompanhar sua evolução por meio dos feedbacks recebidos e</w:t>
+      </w:r>
+      <w:r>
+        <w:t>, ainda, há a possibilidade das partes, a seu critério, gravar as</w:t>
+      </w:r>
+      <w:r>
+        <w:t xml:space="preserve"> entrevistas para fins exclusivamente educacionais. Os mentores, por sua vez, são responsáveis pela condução das entrevistas, avaliação do desempenho dos participantes, emissão de recomendações individualizadas e definição das plataformas de videoconferência utilizadas em cada sessão, aproximando o ambiente acadêmico da realidade vivenciada pelas empresas de tecnologia.</w:t>
       </w:r>
     </w:p>
     <w:p>
@@ -3076,9 +3000,6 @@
         <w:jc w:val="both"/>
       </w:pPr>
       <w:r>
-        <w:t xml:space="preserve">A transformação digital tem provocado mudanças significativas na forma como </w:t>
-      </w:r>
-      <w:r>
         <w:t>A preparação para processos seletivos representa um dos principais desafios enfrentados por estudantes e profissionais em início de carreira na área de Tecnologia da Informação. Embora a formação acadêmica forneça uma base técnica consistente, o desenvolvimento de competências exigidas durante entrevistas de emprego depende, em grande parte, da vivência prática em situações semelhantes às encontradas no ambiente profissional. Nesse contexto, estratégias de aprendizagem baseadas em simulações têm sido amplamente utilizadas por instituições de ensino e organizações por permitirem que os participantes desenvolvam conhecimentos técnicos e habilidades interpessoais em ambientes controlados, reduzindo a insegurança e aumentando a confiança para situações reais.</w:t>
       </w:r>
     </w:p>
@@ -3641,105 +3562,6 @@
     </w:p>
     <w:p>
       <w:pPr>
-        <w:spacing w:after="0"/>
-        <w:ind w:right="-1" w:firstLine="284"/>
-        <w:jc w:val="both"/>
-        <w:rPr>
-          <w:rFonts w:ascii="Times New Roman" w:eastAsia="Times New Roman" w:hAnsi="Times New Roman" w:cs="Times New Roman"/>
-          <w:sz w:val="24"/>
-          <w:szCs w:val="24"/>
-          <w:lang w:eastAsia="pt-BR"/>
-        </w:rPr>
-      </w:pPr>
-      <w:r>
-        <w:rPr>
-          <w:rFonts w:ascii="Times New Roman" w:eastAsia="Times New Roman" w:hAnsi="Times New Roman" w:cs="Times New Roman"/>
-          <w:sz w:val="24"/>
-          <w:szCs w:val="24"/>
-          <w:lang w:eastAsia="pt-BR"/>
-        </w:rPr>
-        <w:t>A Figura 1 apresenta o diagrama de casos de uso do sistema, ilustrando as principais funcionalidades disponibilizadas aos diferentes perfis de usuários.</w:t>
-      </w:r>
-    </w:p>
-    <w:p>
-      <w:pPr>
-        <w:spacing w:after="0"/>
-        <w:ind w:right="-1" w:firstLine="284"/>
-        <w:jc w:val="both"/>
-        <w:rPr>
-          <w:rFonts w:ascii="Times New Roman" w:eastAsia="Times New Roman" w:hAnsi="Times New Roman" w:cs="Times New Roman"/>
-          <w:sz w:val="24"/>
-          <w:szCs w:val="24"/>
-          <w:lang w:eastAsia="pt-BR"/>
-        </w:rPr>
-      </w:pPr>
-    </w:p>
-    <w:p>
-      <w:pPr>
-        <w:spacing w:after="0"/>
-        <w:ind w:right="-1" w:firstLine="284"/>
-        <w:jc w:val="center"/>
-        <w:rPr>
-          <w:rFonts w:ascii="Times New Roman" w:eastAsia="Times New Roman" w:hAnsi="Times New Roman" w:cs="Times New Roman"/>
-          <w:sz w:val="24"/>
-          <w:szCs w:val="24"/>
-          <w:lang w:eastAsia="pt-BR"/>
-        </w:rPr>
-      </w:pPr>
-      <w:r>
-        <w:rPr>
-          <w:rFonts w:ascii="Times New Roman" w:eastAsia="Times New Roman" w:hAnsi="Times New Roman" w:cs="Times New Roman"/>
-          <w:b/>
-          <w:bCs/>
-          <w:sz w:val="24"/>
-          <w:szCs w:val="24"/>
-          <w:highlight w:val="yellow"/>
-          <w:lang w:eastAsia="pt-BR"/>
-        </w:rPr>
-        <w:t xml:space="preserve">[Inserir Figura 1 – Diagrama de Casos de Uso do </w:t>
-      </w:r>
-      <w:proofErr w:type="spellStart"/>
-      <w:r>
-        <w:rPr>
-          <w:rFonts w:ascii="Times New Roman" w:eastAsia="Times New Roman" w:hAnsi="Times New Roman" w:cs="Times New Roman"/>
-          <w:b/>
-          <w:bCs/>
-          <w:sz w:val="24"/>
-          <w:szCs w:val="24"/>
-          <w:highlight w:val="yellow"/>
-          <w:lang w:eastAsia="pt-BR"/>
-        </w:rPr>
-        <w:t>MockMentor</w:t>
-      </w:r>
-      <w:proofErr w:type="spellEnd"/>
-      <w:r>
-        <w:rPr>
-          <w:rFonts w:ascii="Times New Roman" w:eastAsia="Times New Roman" w:hAnsi="Times New Roman" w:cs="Times New Roman"/>
-          <w:b/>
-          <w:bCs/>
-          <w:sz w:val="24"/>
-          <w:szCs w:val="24"/>
-          <w:highlight w:val="yellow"/>
-          <w:lang w:eastAsia="pt-BR"/>
-        </w:rPr>
-        <w:t>]</w:t>
-      </w:r>
-    </w:p>
-    <w:p>
-      <w:pPr>
-        <w:spacing w:after="0"/>
-        <w:ind w:right="-1" w:firstLine="284"/>
-        <w:jc w:val="both"/>
-        <w:rPr>
-          <w:rFonts w:ascii="Times New Roman" w:eastAsia="Times New Roman" w:hAnsi="Times New Roman" w:cs="Times New Roman"/>
-          <w:sz w:val="24"/>
-          <w:szCs w:val="24"/>
-          <w:lang w:eastAsia="pt-BR"/>
-        </w:rPr>
-      </w:pPr>
-    </w:p>
-    <w:p>
-      <w:pPr>
         <w:pStyle w:val="pdq2pgselectionanchorcontainer"/>
         <w:spacing w:before="0" w:beforeAutospacing="0" w:after="0" w:afterAutospacing="0"/>
         <w:ind w:firstLine="284"/>
@@ -3765,10 +3587,7 @@
         <w:jc w:val="both"/>
       </w:pPr>
       <w:r>
-        <w:t xml:space="preserve">O perfil </w:t>
-      </w:r>
-      <w:r>
-        <w:t>“</w:t>
+        <w:t>O perfil “</w:t>
       </w:r>
       <w:r>
         <w:rPr>
@@ -3784,11 +3603,7 @@
         <w:t>”</w:t>
       </w:r>
       <w:r>
-        <w:t xml:space="preserve"> reúne as funcionalidades relacionadas ao processo de preparação profissional, permitindo o cadastro e edição de informações pessoais, seleção das áreas de interesse, agendamento de entrevistas simuladas, participação nas sessões, consulta ao histórico de entrevistas realizadas, acesso aos feedbacks fornecidos pelos mentores e </w:t>
-      </w:r>
-      <w:r>
-        <w:lastRenderedPageBreak/>
-        <w:t>acompanhamento de indicadores de desempenho gerados pela plataforma. O estudante também pode acessar as gravações das entrevistas realizadas, quando autorizadas, utilizando esse recurso exclusivamente como ferramenta de estudo e aperfeiçoamento.</w:t>
+        <w:t xml:space="preserve"> reúne as funcionalidades relacionadas ao processo de preparação profissional, permitindo o cadastro e edição de informações pessoais, seleção das áreas de interesse, agendamento de entrevistas simuladas, participação nas sessões, consulta ao histórico de entrevistas realizadas, acesso aos feedbacks fornecidos pelos mentores e acompanhamento de indicadores de desempenho gerados pela plataforma.</w:t>
       </w:r>
     </w:p>
     <w:p>
@@ -3799,10 +3614,7 @@
         <w:jc w:val="both"/>
       </w:pPr>
       <w:r>
-        <w:t xml:space="preserve">O perfil </w:t>
-      </w:r>
-      <w:r>
-        <w:t>“</w:t>
+        <w:t>O perfil “</w:t>
       </w:r>
       <w:r>
         <w:rPr>
@@ -3818,7 +3630,11 @@
         <w:t>”</w:t>
       </w:r>
       <w:r>
-        <w:t xml:space="preserve"> corresponde aos profissionais responsáveis pela condução das entrevistas simuladas. Além de administrar sua agenda de atendimentos, esse usuário pode cadastrar previamente as plataformas de videoconferência disponibilizadas para realização das entrevistas, aceitar solicitações de agendamento, conduzir as sessões, elaborar avaliações técnicas e comportamentais, registrar feedbacks personalizados e acompanhar o histórico dos estudantes entrevistados.</w:t>
+        <w:t xml:space="preserve"> corresponde aos profissionais responsáveis pela condução das entrevistas simuladas. Além de administrar sua agenda de atendimentos, esse usuário pode cadastrar previamente as plataformas de videoconferência disponibilizadas para realização das entrevistas, aceitar solicitações de agendamento, conduzir as sessões, </w:t>
+      </w:r>
+      <w:r>
+        <w:lastRenderedPageBreak/>
+        <w:t>elaborar avaliações técnicas e comportamentais, registrar feedbacks personalizados e acompanhar o histórico dos estudantes entrevistados.</w:t>
       </w:r>
     </w:p>
     <w:p>
@@ -3829,10 +3645,7 @@
         <w:jc w:val="both"/>
       </w:pPr>
       <w:r>
-        <w:t xml:space="preserve">O perfil </w:t>
-      </w:r>
-      <w:r>
-        <w:t>“</w:t>
+        <w:t>O perfil “</w:t>
       </w:r>
       <w:r>
         <w:rPr>
@@ -3848,7 +3661,7 @@
         <w:t>”</w:t>
       </w:r>
       <w:r>
-        <w:t xml:space="preserve"> possui acesso às funcionalidades administrativas da plataforma, sendo responsável pelo gerenciamento dos usuários, validação dos cadastros de mentores, monitoramento das entrevistas realizadas, administração das gravações, moderação de </w:t>
+        <w:t xml:space="preserve"> possui acesso às funcionalidades administrativas da plataforma, sendo responsável pelo gerenciamento dos usuários, validação dos cadastros de mentores, monitoramento das entrevistas realizadas, moderação de </w:t>
       </w:r>
       <w:proofErr w:type="spellStart"/>
       <w:r>
@@ -3951,13 +3764,29 @@
         <w:jc w:val="both"/>
       </w:pPr>
       <w:r>
-        <w:t xml:space="preserve">Como recurso complementar de aprendizagem, a plataforma possibilita o armazenamento da gravação da entrevista, mediante autorização dos participantes. As gravações permanecem disponíveis exclusivamente para o estudante e para o mentor, sendo destinadas apenas à revisão do desempenho e ao acompanhamento da evolução durante o processo de preparação profissional. Sua utilização é restrita ao ambiente do </w:t>
-      </w:r>
-      <w:proofErr w:type="spellStart"/>
-      <w:r>
-        <w:t>MockMentor</w:t>
-      </w:r>
-      <w:proofErr w:type="spellEnd"/>
+        <w:t xml:space="preserve">Como recurso complementar de aprendizagem, </w:t>
+      </w:r>
+      <w:r>
+        <w:t>as partes podem realizar a gravação das entrevistas simuladas, de forma privada. Entretanto, as gravações só podem ser utilizadas</w:t>
+      </w:r>
+      <w:r>
+        <w:t xml:space="preserve"> exclusivamente </w:t>
+      </w:r>
+      <w:r>
+        <w:t>pelo</w:t>
+      </w:r>
+      <w:r>
+        <w:t xml:space="preserve"> estudante e </w:t>
+      </w:r>
+      <w:r>
+        <w:t>pelo</w:t>
+      </w:r>
+      <w:r>
+        <w:t xml:space="preserve"> mentor, sendo destinadas apenas à revisão do desempenho e ao acompanhamento da evolução durante o processo de preparação profissional. Sua utilização é restrita</w:t>
+      </w:r>
+      <w:r>
+        <w:t xml:space="preserve"> para fins educacionais</w:t>
+      </w:r>
       <w:r>
         <w:t>, sendo vedada qualquer forma de reprodução, compartilhamento ou utilização para fins comerciais, em conformidade com os termos de uso da plataforma e com os princípios estabelecidos pela Lei Geral de Proteção de Dados Pessoais (Lei nº 13.709/2018).</w:t>
       </w:r>
@@ -3970,11 +3799,7 @@
         <w:jc w:val="both"/>
       </w:pPr>
       <w:r>
-        <w:t xml:space="preserve">Além da organização da arquitetura de software, durante o desenvolvimento foram adotadas boas práticas de engenharia de software, incluindo modularização do código, reutilização de componentes, separação entre lógica de negócios e interface gráfica, </w:t>
-      </w:r>
-      <w:r>
-        <w:lastRenderedPageBreak/>
-        <w:t xml:space="preserve">controle de versões utilizando </w:t>
+        <w:t xml:space="preserve">Além da organização da arquitetura de software, durante o desenvolvimento foram adotadas boas práticas de engenharia de software, incluindo modularização do código, reutilização de componentes, separação entre lógica de negócios e interface gráfica, controle de versões utilizando </w:t>
       </w:r>
       <w:proofErr w:type="spellStart"/>
       <w:r>
@@ -3982,7 +3807,25 @@
       </w:r>
       <w:proofErr w:type="spellEnd"/>
       <w:r>
-        <w:t xml:space="preserve"> e documentação contínua do projeto. Essas práticas favoreceram a manutenção da aplicação, facilitaram futuras implementações e contribuíram para a escalabilidade do sistema.</w:t>
+        <w:t xml:space="preserve"> e documentação contínua do projeto. Essas práticas favore</w:t>
+      </w:r>
+      <w:r>
+        <w:t>cem</w:t>
+      </w:r>
+      <w:r>
+        <w:t xml:space="preserve"> a manutenção da aplicação, facilita</w:t>
+      </w:r>
+      <w:r>
+        <w:t>m</w:t>
+      </w:r>
+      <w:r>
+        <w:t xml:space="preserve"> futuras implementações e </w:t>
+      </w:r>
+      <w:r>
+        <w:t>contribuem</w:t>
+      </w:r>
+      <w:r>
+        <w:t xml:space="preserve"> para a escalabilidade do sistema.</w:t>
       </w:r>
     </w:p>
     <w:p>
@@ -3993,7 +3836,11 @@
         <w:jc w:val="both"/>
       </w:pPr>
       <w:r>
-        <w:t>A arquitetura adotada mostrou-se adequada aos objetivos do projeto, permitindo o desenvolvimento de uma plataforma modular, segura e escalável para o gerenciamento de entrevistas simuladas. A utilização de tecnologias amplamente consolidadas no desenvolvimento web, aliada às boas práticas de engenharia de software, favorece a evolução contínua da aplicação, possibilita a incorporação de novas funcionalidades e contribui para oferecer uma experiência consistente tanto para estudantes quanto para mentores.</w:t>
+        <w:t xml:space="preserve">A arquitetura adotada mostrou-se adequada aos objetivos do projeto, permitindo o desenvolvimento de uma plataforma modular, segura e escalável para o gerenciamento de entrevistas simuladas. A utilização de tecnologias amplamente consolidadas no desenvolvimento web, aliada às boas práticas de engenharia de software, favorece a evolução contínua da aplicação, possibilita a incorporação de novas funcionalidades e </w:t>
+      </w:r>
+      <w:r>
+        <w:lastRenderedPageBreak/>
+        <w:t>contribui para oferecer uma experiência consistente tanto para estudantes quanto para mentores.</w:t>
       </w:r>
     </w:p>
     <w:p>
@@ -4136,7 +3983,13 @@
         <w:jc w:val="both"/>
       </w:pPr>
       <w:r>
-        <w:t>A Figura 2 apresenta a página inicial da plataforma.</w:t>
+        <w:t xml:space="preserve">A Figura </w:t>
+      </w:r>
+      <w:r>
+        <w:t>1</w:t>
+      </w:r>
+      <w:r>
+        <w:t xml:space="preserve"> apresenta a página inicial da plataforma.</w:t>
       </w:r>
     </w:p>
     <w:p>
@@ -4162,7 +4015,21 @@
           <w:rStyle w:val="Forte"/>
           <w:highlight w:val="yellow"/>
         </w:rPr>
-        <w:t>[Figura 2 – Página inicial (</w:t>
+        <w:t xml:space="preserve">[Figura </w:t>
+      </w:r>
+      <w:r>
+        <w:rPr>
+          <w:rStyle w:val="Forte"/>
+          <w:highlight w:val="yellow"/>
+        </w:rPr>
+        <w:t>1</w:t>
+      </w:r>
+      <w:r>
+        <w:rPr>
+          <w:rStyle w:val="Forte"/>
+          <w:highlight w:val="yellow"/>
+        </w:rPr>
+        <w:t xml:space="preserve"> – Página inicial (</w:t>
       </w:r>
       <w:proofErr w:type="spellStart"/>
       <w:r>
@@ -4224,7 +4091,13 @@
         <w:jc w:val="both"/>
       </w:pPr>
       <w:r>
-        <w:t>Após a autenticação, o estudante é direcionado ao painel principal da plataforma, ilustrado na Figura 3.</w:t>
+        <w:t xml:space="preserve">Após a autenticação, o estudante é direcionado ao painel principal da plataforma, ilustrado na Figura </w:t>
+      </w:r>
+      <w:r>
+        <w:t>2</w:t>
+      </w:r>
+      <w:r>
+        <w:t>.</w:t>
       </w:r>
     </w:p>
     <w:p>
@@ -4251,7 +4124,21 @@
           <w:rStyle w:val="Forte"/>
           <w:highlight w:val="yellow"/>
         </w:rPr>
-        <w:t>[Figura 3 – Dashboard do estudante.]</w:t>
+        <w:t xml:space="preserve">[Figura </w:t>
+      </w:r>
+      <w:r>
+        <w:rPr>
+          <w:rStyle w:val="Forte"/>
+          <w:highlight w:val="yellow"/>
+        </w:rPr>
+        <w:t>2</w:t>
+      </w:r>
+      <w:r>
+        <w:rPr>
+          <w:rStyle w:val="Forte"/>
+          <w:highlight w:val="yellow"/>
+        </w:rPr>
+        <w:t xml:space="preserve"> – Dashboard do estudante.]</w:t>
       </w:r>
     </w:p>
     <w:p>
@@ -4281,7 +4168,13 @@
         <w:jc w:val="both"/>
       </w:pPr>
       <w:r>
-        <w:t>A Figura 4 apresenta o módulo de agendamento de entrevistas.</w:t>
+        <w:t xml:space="preserve">A Figura </w:t>
+      </w:r>
+      <w:r>
+        <w:t>3</w:t>
+      </w:r>
+      <w:r>
+        <w:t xml:space="preserve"> apresenta o módulo de agendamento de entrevistas.</w:t>
       </w:r>
     </w:p>
     <w:p>
@@ -4308,7 +4201,21 @@
           <w:rStyle w:val="Forte"/>
           <w:highlight w:val="yellow"/>
         </w:rPr>
-        <w:t>[Figura 4 – Tela de agendamento de entrevistas.]</w:t>
+        <w:t xml:space="preserve">[Figura </w:t>
+      </w:r>
+      <w:r>
+        <w:rPr>
+          <w:rStyle w:val="Forte"/>
+          <w:highlight w:val="yellow"/>
+        </w:rPr>
+        <w:t>3</w:t>
+      </w:r>
+      <w:r>
+        <w:rPr>
+          <w:rStyle w:val="Forte"/>
+          <w:highlight w:val="yellow"/>
+        </w:rPr>
+        <w:t xml:space="preserve"> – Tela de agendamento de entrevistas.]</w:t>
       </w:r>
     </w:p>
     <w:p>
@@ -4327,7 +4234,11 @@
         <w:jc w:val="both"/>
       </w:pPr>
       <w:r>
-        <w:t>Nesse módulo, os estudantes podem selecionar mentores disponíveis, escolher a data e o horário da entrevista e definir o tema desejado, como desenvolvimento web, bancos de dados, metodologias ágeis, estruturas de dados, testes técnicos ou entrevistas conduzidas em língua inglesa. O sistema realiza automaticamente o controle da disponibilidade dos mentores, evitando conflitos de horários e garantindo maior organização dos atendimentos.</w:t>
+        <w:t xml:space="preserve">Nesse módulo, os estudantes podem selecionar mentores disponíveis, escolher a data e o horário da entrevista e definir o tema desejado, como desenvolvimento web, bancos de dados, metodologias ágeis, estruturas de dados, testes técnicos ou entrevistas conduzidas em língua inglesa. O sistema realiza automaticamente o controle da </w:t>
+      </w:r>
+      <w:r>
+        <w:lastRenderedPageBreak/>
+        <w:t>disponibilidade dos mentores, evitando conflitos de horários e garantindo maior organização dos atendimentos.</w:t>
       </w:r>
     </w:p>
     <w:p>
@@ -4365,7 +4276,13 @@
         <w:jc w:val="both"/>
       </w:pPr>
       <w:r>
-        <w:t>A Figura 5 apresenta a tela de acompanhamento das entrevistas agendadas.</w:t>
+        <w:t xml:space="preserve">A Figura </w:t>
+      </w:r>
+      <w:r>
+        <w:t>4</w:t>
+      </w:r>
+      <w:r>
+        <w:t xml:space="preserve"> apresenta a tela de acompanhamento das entrevistas agendadas.</w:t>
       </w:r>
     </w:p>
     <w:p>
@@ -4392,7 +4309,21 @@
           <w:rStyle w:val="Forte"/>
           <w:highlight w:val="yellow"/>
         </w:rPr>
-        <w:t>[Figura 5 – Tela de acompanhamento da entrevista simulada.]</w:t>
+        <w:t xml:space="preserve">[Figura </w:t>
+      </w:r>
+      <w:r>
+        <w:rPr>
+          <w:rStyle w:val="Forte"/>
+          <w:highlight w:val="yellow"/>
+        </w:rPr>
+        <w:t>4</w:t>
+      </w:r>
+      <w:r>
+        <w:rPr>
+          <w:rStyle w:val="Forte"/>
+          <w:highlight w:val="yellow"/>
+        </w:rPr>
+        <w:t xml:space="preserve"> – Tela de acompanhamento da entrevista simulada.]</w:t>
       </w:r>
     </w:p>
     <w:p>
@@ -4438,7 +4369,7 @@
       </w:r>
       <w:proofErr w:type="spellEnd"/>
       <w:r>
-        <w:t xml:space="preserve"> e confirmar sua participação por meio de um botão específico disponibilizado na plataforma. Esse mecanismo registra eletronicamente o comparecimento das partes, permitindo identificar entrevistas efetivamente realizadas, ausências e cancelamentos, além de manter um histórico confiável das atividades desenvolvidas.</w:t>
+        <w:t xml:space="preserve"> e confirmar sua participação por meio de um botão específico disponibilizado na plataforma. Esse mecanismo registra o comparecimento das partes, permitindo identificar entrevistas efetivamente realizadas, ausências e cancelamentos, além de manter um histórico confiável das atividades desenvolvidas.</w:t>
       </w:r>
     </w:p>
     <w:p>
@@ -4460,7 +4391,22 @@
         <w:jc w:val="both"/>
       </w:pPr>
       <w:r>
-        <w:t>Como recurso complementar de aprendizagem, a plataforma permite o armazenamento da gravação das entrevistas, desde que haja consentimento das partes no momento do cadastro e aceitação dos Termos de Uso. As gravações permanecem disponíveis exclusivamente para o estudante e o mentor, com finalidade estritamente educacional, possibilitando a revisão das respostas, identificação de oportunidades de melhoria e acompanhamento da evolução do participante.</w:t>
+        <w:t xml:space="preserve">Em conformidade com a Lei Geral de Proteção de Dados Pessoais (Lei nº 13.709/2018), </w:t>
+      </w:r>
+      <w:r>
+        <w:t xml:space="preserve">os </w:t>
+      </w:r>
+      <w:r>
+        <w:t>Termos de Uso estabelecem que as gravações</w:t>
+      </w:r>
+      <w:r>
+        <w:t xml:space="preserve"> eventualmente feitas pelas partes</w:t>
+      </w:r>
+      <w:r>
+        <w:t xml:space="preserve"> não poderão ser reproduzidas, compartilhadas ou utilizadas para quaisquer fins comerciais</w:t>
+      </w:r>
+      <w:r>
+        <w:t>, bem como está adequada ao tratamento de dados pessoais dos membros da plataforma, garantindo a exclusão dos dados quando solicitado, além do armazenamento de dados pelo período previsto legalmente.</w:t>
       </w:r>
     </w:p>
     <w:p>
@@ -4471,7 +4417,99 @@
         <w:jc w:val="both"/>
       </w:pPr>
       <w:r>
-        <w:t>Em conformidade com a Lei Geral de Proteção de Dados Pessoais (Lei nº 13.709/2018), o tratamento das gravações observa os princípios da finalidade, necessidade e segurança das informações. Os Termos de Uso estabelecem que as gravações não poderão ser reproduzidas, compartilhadas ou utilizadas para quaisquer fins comerciais, permanecendo acessíveis apenas dentro da plataforma. Também é garantido aos participantes o direito de solicitar a exclusão definitiva das gravações após o período de retenção estabelecido pela plataforma, assegurando maior proteção à privacidade e aos dados pessoais.</w:t>
+        <w:t>Os resultados obtidos demonstram que a arquitetura adotada permitiu desenvolver uma plataforma funcional, segura e preparada para futuras expansões. A utilização de tecnologias modernas de desenvolvimento web favoreceu a construção de uma aplicação escalável, capaz de integrar novos recursos, como ferramentas de inteligência artificial para apoio à avaliação, integração com plataformas de recrutamento e seleção, emissão automatizada de certificados e geração de relatórios gerenciais destinados a instituições de ensino e organizações parceiras.</w:t>
+      </w:r>
+    </w:p>
+    <w:p>
+      <w:pPr>
+        <w:spacing w:after="0" w:line="240" w:lineRule="auto"/>
+        <w:ind w:firstLine="284"/>
+        <w:jc w:val="both"/>
+        <w:rPr>
+          <w:rFonts w:ascii="Times New Roman" w:eastAsia="Times New Roman" w:hAnsi="Times New Roman" w:cs="Times New Roman"/>
+          <w:sz w:val="24"/>
+          <w:szCs w:val="24"/>
+          <w:lang w:eastAsia="pt-BR"/>
+        </w:rPr>
+      </w:pPr>
+    </w:p>
+    <w:p>
+      <w:pPr>
+        <w:spacing w:after="0" w:line="240" w:lineRule="auto"/>
+        <w:ind w:firstLine="284"/>
+        <w:jc w:val="both"/>
+        <w:rPr>
+          <w:rFonts w:ascii="Times New Roman" w:eastAsia="Times New Roman" w:hAnsi="Times New Roman" w:cs="Times New Roman"/>
+          <w:sz w:val="24"/>
+          <w:szCs w:val="24"/>
+          <w:lang w:eastAsia="pt-BR"/>
+        </w:rPr>
+      </w:pPr>
+    </w:p>
+    <w:p>
+      <w:pPr>
+        <w:ind w:left="1276" w:right="282" w:hanging="567"/>
+        <w:jc w:val="both"/>
+        <w:rPr>
+          <w:rFonts w:ascii="Times New Roman" w:hAnsi="Times New Roman" w:cs="Times New Roman"/>
+          <w:b/>
+          <w:sz w:val="24"/>
+          <w:szCs w:val="24"/>
+        </w:rPr>
+      </w:pPr>
+      <w:r>
+        <w:rPr>
+          <w:rFonts w:ascii="Times New Roman" w:hAnsi="Times New Roman" w:cs="Times New Roman"/>
+          <w:b/>
+          <w:sz w:val="24"/>
+          <w:szCs w:val="24"/>
+        </w:rPr>
+        <w:t>V.</w:t>
+      </w:r>
+      <w:r>
+        <w:rPr>
+          <w:rFonts w:ascii="Times New Roman" w:hAnsi="Times New Roman" w:cs="Times New Roman"/>
+          <w:b/>
+          <w:sz w:val="24"/>
+          <w:szCs w:val="24"/>
+        </w:rPr>
+        <w:t xml:space="preserve"> </w:t>
+      </w:r>
+      <w:r>
+        <w:rPr>
+          <w:rFonts w:ascii="Times New Roman" w:hAnsi="Times New Roman" w:cs="Times New Roman"/>
+          <w:b/>
+          <w:sz w:val="24"/>
+          <w:szCs w:val="24"/>
+        </w:rPr>
+        <w:t xml:space="preserve"> CONCLUSÃO</w:t>
+      </w:r>
+    </w:p>
+    <w:p>
+      <w:pPr>
+        <w:pStyle w:val="pdq2pgselectionanchorcontainer"/>
+        <w:spacing w:before="0" w:beforeAutospacing="0" w:after="0" w:afterAutospacing="0"/>
+        <w:ind w:firstLine="284"/>
+        <w:jc w:val="both"/>
+      </w:pPr>
+      <w:r>
+        <w:t xml:space="preserve">O presente trabalho apresentou o desenvolvimento do </w:t>
+      </w:r>
+      <w:proofErr w:type="spellStart"/>
+      <w:r>
+        <w:rPr>
+          <w:rStyle w:val="Forte"/>
+          <w:b w:val="0"/>
+        </w:rPr>
+        <w:t>MockMentor</w:t>
+      </w:r>
+      <w:proofErr w:type="spellEnd"/>
+      <w:r>
+        <w:t xml:space="preserve">, uma plataforma web destinada à preparação de estudantes da área de Tecnologia da Informação para processos seletivos por meio de entrevistas técnicas simuladas conduzidas por profissionais experientes. A solução foi desenvolvida com o objetivo de aproximar a formação acadêmica das exigências do mercado de trabalho, oferecendo um ambiente </w:t>
+      </w:r>
+      <w:r>
+        <w:lastRenderedPageBreak/>
+        <w:t>estruturado para prática de entrevistas, acompanhamento da evolução dos estudantes e emissão de feedbacks personalizados.</w:t>
       </w:r>
     </w:p>
     <w:p>
@@ -4482,96 +4520,7 @@
         <w:jc w:val="both"/>
       </w:pPr>
       <w:r>
-        <w:lastRenderedPageBreak/>
-        <w:t>Os resultados obtidos demonstram que a arquitetura adotada permitiu desenvolver uma plataforma funcional, segura e preparada para futuras expansões. A utilização de tecnologias modernas de desenvolvimento web favoreceu a construção de uma aplicação escalável, capaz de integrar novos recursos, como ferramentas de inteligência artificial para apoio à avaliação, integração com plataformas de recrutamento e seleção, emissão automatizada de certificados e geração de relatórios gerenciais destinados a instituições de ensino e organizações parceiras.</w:t>
-      </w:r>
-    </w:p>
-    <w:p>
-      <w:pPr>
-        <w:spacing w:after="0" w:line="240" w:lineRule="auto"/>
-        <w:ind w:firstLine="284"/>
-        <w:jc w:val="both"/>
-        <w:rPr>
-          <w:rFonts w:ascii="Times New Roman" w:eastAsia="Times New Roman" w:hAnsi="Times New Roman" w:cs="Times New Roman"/>
-          <w:sz w:val="24"/>
-          <w:szCs w:val="24"/>
-          <w:lang w:eastAsia="pt-BR"/>
-        </w:rPr>
-      </w:pPr>
-    </w:p>
-    <w:p>
-      <w:pPr>
-        <w:spacing w:after="0" w:line="240" w:lineRule="auto"/>
-        <w:ind w:firstLine="284"/>
-        <w:jc w:val="both"/>
-        <w:rPr>
-          <w:rFonts w:ascii="Times New Roman" w:eastAsia="Times New Roman" w:hAnsi="Times New Roman" w:cs="Times New Roman"/>
-          <w:sz w:val="24"/>
-          <w:szCs w:val="24"/>
-          <w:lang w:eastAsia="pt-BR"/>
-        </w:rPr>
-      </w:pPr>
-    </w:p>
-    <w:p>
-      <w:pPr>
-        <w:ind w:left="1276" w:right="282" w:hanging="567"/>
-        <w:jc w:val="both"/>
-        <w:rPr>
-          <w:rFonts w:ascii="Times New Roman" w:hAnsi="Times New Roman" w:cs="Times New Roman"/>
-          <w:b/>
-          <w:sz w:val="24"/>
-          <w:szCs w:val="24"/>
-        </w:rPr>
-      </w:pPr>
-      <w:r>
-        <w:rPr>
-          <w:rFonts w:ascii="Times New Roman" w:hAnsi="Times New Roman" w:cs="Times New Roman"/>
-          <w:b/>
-          <w:sz w:val="24"/>
-          <w:szCs w:val="24"/>
-        </w:rPr>
-        <w:t>V.</w:t>
-      </w:r>
-      <w:r>
-        <w:rPr>
-          <w:rFonts w:ascii="Times New Roman" w:hAnsi="Times New Roman" w:cs="Times New Roman"/>
-          <w:b/>
-          <w:sz w:val="24"/>
-          <w:szCs w:val="24"/>
-        </w:rPr>
-        <w:t xml:space="preserve"> </w:t>
-      </w:r>
-      <w:r>
-        <w:rPr>
-          <w:rFonts w:ascii="Times New Roman" w:hAnsi="Times New Roman" w:cs="Times New Roman"/>
-          <w:b/>
-          <w:sz w:val="24"/>
-          <w:szCs w:val="24"/>
-        </w:rPr>
-        <w:t xml:space="preserve"> CONCLUSÃO</w:t>
-      </w:r>
-    </w:p>
-    <w:p>
-      <w:pPr>
-        <w:pStyle w:val="pdq2pgselectionanchorcontainer"/>
-        <w:spacing w:before="0" w:beforeAutospacing="0" w:after="0" w:afterAutospacing="0"/>
-        <w:ind w:firstLine="284"/>
-        <w:jc w:val="both"/>
-      </w:pPr>
-      <w:r>
-        <w:t xml:space="preserve">O presente trabalho apresentou o desenvolvimento do </w:t>
-      </w:r>
-      <w:proofErr w:type="spellStart"/>
-      <w:r>
-        <w:rPr>
-          <w:rStyle w:val="Forte"/>
-          <w:b w:val="0"/>
-        </w:rPr>
-        <w:t>MockMentor</w:t>
-      </w:r>
-      <w:proofErr w:type="spellEnd"/>
-      <w:r>
-        <w:t>, uma plataforma web destinada à preparação de estudantes da área de Tecnologia da Informação para processos seletivos por meio de entrevistas técnicas simuladas conduzidas por profissionais experientes. A solução foi desenvolvida com o objetivo de aproximar a formação acadêmica das exigências do mercado de trabalho, oferecendo um ambiente estruturado para prática de entrevistas, acompanhamento da evolução dos estudantes e emissão de feedbacks personalizados.</w:t>
+        <w:t>Os resultados obtidos demonstram que a arquitetura adotada, baseada em tecnologias modernas de desenvolvimento web, mostrou-se adequada para atender aos requisitos de desempenho, segurança, escalabilidade e usabilidade definidos para o projeto. A integração entre gerenciamento de usuários, agendamento de entrevistas, acompanhamento das sessões, avaliações individualizadas e armazenamento de informações em um único ambiente proporciona uma experiência completa de preparação profissional, favorecendo o desenvolvimento de competências técnicas, comportamentais e comunicacionais.</w:t>
       </w:r>
     </w:p>
     <w:p>
@@ -4582,7 +4531,7 @@
         <w:jc w:val="both"/>
       </w:pPr>
       <w:r>
-        <w:t>Os resultados obtidos demonstram que a arquitetura adotada, baseada em tecnologias modernas de desenvolvimento web, mostrou-se adequada para atender aos requisitos de desempenho, segurança, escalabilidade e usabilidade definidos para o projeto. A integração entre gerenciamento de usuários, agendamento de entrevistas, acompanhamento das sessões, avaliações individualizadas e armazenamento de informações em um único ambiente proporciona uma experiência completa de preparação profissional, favorecendo o desenvolvimento de competências técnicas, comportamentais e comunicacionais.</w:t>
+        <w:t>Um dos principais diferenciais da plataforma consiste na utilização de mentores atuantes no mercado de Tecnologia da Informação para condução das entrevistas simuladas, permitindo que os estudantes recebam orientações fundamentadas em experiências reais da área. Essa abordagem aproxima o ambiente acadêmico das práticas adotadas pelas empresas, contribuindo para o fortalecimento da empregabilidade e para o desenvolvimento de profissionais mais preparados para enfrentar os desafios dos processos seletivos contemporâneos.</w:t>
       </w:r>
     </w:p>
     <w:p>
@@ -4593,7 +4542,15 @@
         <w:jc w:val="both"/>
       </w:pPr>
       <w:r>
-        <w:t>Um dos principais diferenciais da plataforma consiste na utilização de mentores atuantes no mercado de Tecnologia da Informação para condução das entrevistas simuladas, permitindo que os estudantes recebam orientações fundamentadas em experiências reais da área. Essa abordagem aproxima o ambiente acadêmico das práticas adotadas pelas empresas, contribuindo para o fortalecimento da empregabilidade e para o desenvolvimento de profissionais mais preparados para enfrentar os desafios dos processos seletivos contemporâneos.</w:t>
+        <w:t xml:space="preserve">Além dos benefícios aos estudantes, a plataforma favorece a aproximação entre instituições de ensino e o setor produtivo, incentivando a participação de profissionais na formação de novos talentos e promovendo um ambiente colaborativo de troca de conhecimentos. Dessa forma, o </w:t>
+      </w:r>
+      <w:proofErr w:type="spellStart"/>
+      <w:r>
+        <w:t>MockMentor</w:t>
+      </w:r>
+      <w:proofErr w:type="spellEnd"/>
+      <w:r>
+        <w:t xml:space="preserve"> apresenta potencial para contribuir tanto para a qualificação profissional quanto para a redução da distância entre a formação acadêmica e as demandas do mercado de tecnologia.</w:t>
       </w:r>
     </w:p>
     <w:p>
@@ -4604,15 +4561,7 @@
         <w:jc w:val="both"/>
       </w:pPr>
       <w:r>
-        <w:t xml:space="preserve">Além dos benefícios aos estudantes, a plataforma favorece a aproximação entre instituições de ensino e o setor produtivo, incentivando a participação de profissionais na formação de novos talentos e promovendo um ambiente colaborativo de troca de conhecimentos. Dessa forma, o </w:t>
-      </w:r>
-      <w:proofErr w:type="spellStart"/>
-      <w:r>
-        <w:t>MockMentor</w:t>
-      </w:r>
-      <w:proofErr w:type="spellEnd"/>
-      <w:r>
-        <w:t xml:space="preserve"> apresenta potencial para contribuir tanto para a qualificação profissional quanto para a redução da distância entre a formação acadêmica e as demandas do mercado de tecnologia.</w:t>
+        <w:t>Como trabalhos futuros, destacam-se a integração da plataforma com calendários digitais para sincronização automática de agendamentos, a implementação de mecanismos de inteligência artificial para apoio à análise dos feedbacks, a emissão automatizada de certificados de participação, o desenvolvimento de relatórios gerenciais mais completos e a expansão do sistema para outras áreas profissionais além da Tecnologia da Informação. Também poderão ser realizados estudos de usabilidade e avaliações com estudantes e mentores em ambiente real de utilização, permitindo mensurar o impacto da plataforma na preparação para processos seletivos e na empregabilidade dos participantes.</w:t>
       </w:r>
     </w:p>
     <w:p>
@@ -4623,7 +4572,15 @@
         <w:jc w:val="both"/>
       </w:pPr>
       <w:r>
-        <w:t>Como trabalhos futuros, destacam-se a integração da plataforma com calendários digitais para sincronização automática de agendamentos, a implementação de mecanismos de inteligência artificial para apoio à análise dos feedbacks, a emissão automatizada de certificados de participação, o desenvolvimento de relatórios gerenciais mais completos e a expansão do sistema para outras áreas profissionais além da Tecnologia da Informação. Também poderão ser realizados estudos de usabilidade e avaliações com estudantes e mentores em ambiente real de utilização, permitindo mensurar o impacto da plataforma na preparação para processos seletivos e na empregabilidade dos participantes.</w:t>
+        <w:t xml:space="preserve">Conclui-se, portanto, que o </w:t>
+      </w:r>
+      <w:proofErr w:type="spellStart"/>
+      <w:r>
+        <w:t>MockMentor</w:t>
+      </w:r>
+      <w:proofErr w:type="spellEnd"/>
+      <w:r>
+        <w:t xml:space="preserve"> constitui uma solução tecnológica viável, escalável e alinhada às necessidades atuais do mercado de trabalho, demonstrando potencial para contribuir de forma significativa com a preparação de estudantes para entrevistas técnicas e com o fortalecimento da conexão entre educação e mercado profissional.</w:t>
       </w:r>
     </w:p>
     <w:p>
@@ -4633,21 +4590,6 @@
         <w:ind w:firstLine="284"/>
         <w:jc w:val="both"/>
       </w:pPr>
-      <w:r>
-        <w:t xml:space="preserve">Conclui-se, portanto, que o </w:t>
-      </w:r>
-      <w:proofErr w:type="spellStart"/>
-      <w:r>
-        <w:t>MockMentor</w:t>
-      </w:r>
-      <w:proofErr w:type="spellEnd"/>
-      <w:r>
-        <w:t xml:space="preserve"> constitui uma solução tecnológica viável, escalável e alinhada às necessidades atuais do mercado de trabalho, demonstrando potencial para contribuir de forma significativa com a preparação de estudantes para </w:t>
-      </w:r>
-      <w:r>
-        <w:lastRenderedPageBreak/>
-        <w:t>entrevistas técnicas e com o fortalecimento da conexão entre educação e mercado profissional.</w:t>
-      </w:r>
     </w:p>
     <w:p>
       <w:pPr>
@@ -4659,14 +4601,6 @@
     </w:p>
     <w:p>
       <w:pPr>
-        <w:pStyle w:val="NormalWeb"/>
-        <w:spacing w:before="0" w:beforeAutospacing="0" w:after="0" w:afterAutospacing="0"/>
-        <w:ind w:firstLine="284"/>
-        <w:jc w:val="both"/>
-      </w:pPr>
-    </w:p>
-    <w:p>
-      <w:pPr>
         <w:ind w:left="1276" w:right="282" w:hanging="567"/>
         <w:jc w:val="both"/>
         <w:rPr>
@@ -4676,8 +4610,6 @@
           <w:szCs w:val="24"/>
         </w:rPr>
       </w:pPr>
-      <w:bookmarkStart w:id="0" w:name="_GoBack"/>
-      <w:bookmarkEnd w:id="0"/>
       <w:r>
         <w:rPr>
           <w:rFonts w:ascii="Times New Roman" w:hAnsi="Times New Roman" w:cs="Times New Roman"/>
@@ -4985,7 +4917,16 @@
           <w:sz w:val="24"/>
           <w:szCs w:val="24"/>
         </w:rPr>
-        <w:t>https://brasscom.org.br/wp-content/uploads/2025/02/Relatorio-Perspectivas-do-Mercado-de-Trabalho.pdf</w:t>
+        <w:t>https://brasscom.org.br/wp-</w:t>
+      </w:r>
+      <w:r>
+        <w:rPr>
+          <w:rFonts w:ascii="Times New Roman" w:hAnsi="Times New Roman" w:cs="Times New Roman"/>
+          <w:sz w:val="24"/>
+          <w:szCs w:val="24"/>
+        </w:rPr>
+        <w:lastRenderedPageBreak/>
+        <w:t>content/uploads/2025/02/Relatorio-Perspectivas-do-Mercado-de-Trabalho.pdf</w:t>
       </w:r>
       <w:r>
         <w:rPr>
@@ -6333,6 +6274,7 @@
   <w:style w:type="character" w:default="1" w:styleId="Fontepargpadro">
     <w:name w:val="Default Paragraph Font"/>
     <w:uiPriority w:val="1"/>
+    <w:semiHidden/>
     <w:unhideWhenUsed/>
   </w:style>
   <w:style w:type="table" w:default="1" w:styleId="Tabelanormal">

</xml_diff>